<commit_message>
completed simplenotificationsystem3tier with screenshot
</commit_message>
<xml_diff>
--- a/Vaibhav_Gupta_Multi-Tier Application _Assignment.docx
+++ b/Vaibhav_Gupta_Multi-Tier Application _Assignment.docx
@@ -3,9 +3,6 @@
 <w:document xmlns:wpc="http://schemas.microsoft.com/office/word/2010/wordprocessingCanvas" xmlns:cx="http://schemas.microsoft.com/office/drawing/2014/chartex" xmlns:cx1="http://schemas.microsoft.com/office/drawing/2015/9/8/chartex" xmlns:cx2="http://schemas.microsoft.com/office/drawing/2015/10/21/chartex" xmlns:cx3="http://schemas.microsoft.com/office/drawing/2016/5/9/chartex" xmlns:cx4="http://schemas.microsoft.com/office/drawing/2016/5/10/chartex" xmlns:cx5="http://schemas.microsoft.com/office/drawing/2016/5/11/chartex" xmlns:cx6="http://schemas.microsoft.com/office/drawing/2016/5/12/chartex" xmlns:cx7="http://schemas.microsoft.com/office/drawing/2016/5/13/chartex" xmlns:cx8="http://schemas.microsoft.com/office/drawing/2016/5/14/chartex" xmlns:mc="http://schemas.openxmlformats.org/markup-compatibility/2006" xmlns:aink="http://schemas.microsoft.com/office/drawing/2016/ink" xmlns:am3d="http://schemas.microsoft.com/office/drawing/2017/model3d" xmlns:o="urn:schemas-microsoft-com:office:office" xmlns:oel="http://schemas.microsoft.com/office/2019/extlst" xmlns:r="http://schemas.openxmlformats.org/officeDocument/2006/relationships" xmlns:m="http://schemas.openxmlformats.org/officeDocument/2006/math" xmlns:v="urn:schemas-microsoft-com:vml" xmlns:wp14="http://schemas.microsoft.com/office/word/2010/wordprocessingDrawing" xmlns:wp="http://schemas.openxmlformats.org/drawingml/2006/wordprocessingDrawing" xmlns:w10="urn:schemas-microsoft-com:office:word" xmlns:w="http://schemas.openxmlformats.org/wordprocessingml/2006/main" xmlns:w14="http://schemas.microsoft.com/office/word/2010/wordml" xmlns:w15="http://schemas.microsoft.com/office/word/2012/wordml" xmlns:w16cex="http://schemas.microsoft.com/office/word/2018/wordml/cex" xmlns:w16cid="http://schemas.microsoft.com/office/word/2016/wordml/cid" xmlns:w16="http://schemas.microsoft.com/office/word/2018/wordml" xmlns:w16du="http://schemas.microsoft.com/office/word/2023/wordml/word16du" xmlns:w16sdtdh="http://schemas.microsoft.com/office/word/2020/wordml/sdtdatahash" xmlns:w16sdtfl="http://schemas.microsoft.com/office/word/2024/wordml/sdtformatlock" xmlns:w16se="http://schemas.microsoft.com/office/word/2015/wordml/symex" xmlns:wpg="http://schemas.microsoft.com/office/word/2010/wordprocessingGroup" xmlns:wpi="http://schemas.microsoft.com/office/word/2010/wordprocessingInk" xmlns:wne="http://schemas.microsoft.com/office/word/2006/wordml" xmlns:wps="http://schemas.microsoft.com/office/word/2010/wordprocessingShape" mc:Ignorable="w14 w15 w16se w16cid w16 w16cex w16sdtdh w16sdtfl w16du wp14">
   <w:body>
     <w:p>
-      <w:pPr>
-        <w:pStyle w:val="Heading1"/>
-      </w:pPr>
       <w:r>
         <w:t xml:space="preserve">Vaibhav Gupta </w:t>
       </w:r>
@@ -25,7 +22,28 @@
       </w:r>
       <w:proofErr w:type="spellEnd"/>
       <w:r>
-        <w:t xml:space="preserve"> Link : Link</w:t>
+        <w:t xml:space="preserve"> </w:t>
+      </w:r>
+      <w:proofErr w:type="gramStart"/>
+      <w:r>
+        <w:t>Link :</w:t>
+      </w:r>
+      <w:proofErr w:type="gramEnd"/>
+      <w:r>
+        <w:t xml:space="preserve"> </w:t>
+      </w:r>
+      <w:hyperlink r:id="rId5" w:history="1">
+        <w:r>
+          <w:rPr>
+            <w:rStyle w:val="Hyperlink"/>
+          </w:rPr>
+          <w:t>Link</w:t>
+        </w:r>
+      </w:hyperlink>
+    </w:p>
+    <w:p>
+      <w:r>
+        <w:t>https://github.com/114-Vaibhav/SimpleNotificationSystem</w:t>
       </w:r>
     </w:p>
     <w:p>
@@ -46,7 +64,7 @@
                     <pic:cNvPicPr/>
                   </pic:nvPicPr>
                   <pic:blipFill>
-                    <a:blip r:embed="rId5"/>
+                    <a:blip r:embed="rId6"/>
                     <a:stretch>
                       <a:fillRect/>
                     </a:stretch>
@@ -67,9 +85,9 @@
         </w:drawing>
       </w:r>
     </w:p>
+    <w:p/>
     <w:p>
       <w:r>
-        <w:lastRenderedPageBreak/>
         <w:drawing>
           <wp:inline distT="0" distB="0" distL="0" distR="0" wp14:anchorId="4871C62A" wp14:editId="404070B7">
             <wp:extent cx="5943600" cy="7126605"/>
@@ -86,7 +104,7 @@
                     <pic:cNvPicPr/>
                   </pic:nvPicPr>
                   <pic:blipFill>
-                    <a:blip r:embed="rId6"/>
+                    <a:blip r:embed="rId7"/>
                     <a:stretch>
                       <a:fillRect/>
                     </a:stretch>
@@ -126,7 +144,7 @@
                     <pic:cNvPicPr/>
                   </pic:nvPicPr>
                   <pic:blipFill>
-                    <a:blip r:embed="rId7"/>
+                    <a:blip r:embed="rId8"/>
                     <a:stretch>
                       <a:fillRect/>
                     </a:stretch>
@@ -166,7 +184,7 @@
                     <pic:cNvPicPr/>
                   </pic:nvPicPr>
                   <pic:blipFill>
-                    <a:blip r:embed="rId8"/>
+                    <a:blip r:embed="rId9"/>
                     <a:stretch>
                       <a:fillRect/>
                     </a:stretch>
@@ -206,7 +224,7 @@
                     <pic:cNvPicPr/>
                   </pic:nvPicPr>
                   <pic:blipFill>
-                    <a:blip r:embed="rId9"/>
+                    <a:blip r:embed="rId10"/>
                     <a:stretch>
                       <a:fillRect/>
                     </a:stretch>
@@ -246,7 +264,7 @@
                     <pic:cNvPicPr/>
                   </pic:nvPicPr>
                   <pic:blipFill>
-                    <a:blip r:embed="rId10"/>
+                    <a:blip r:embed="rId11"/>
                     <a:stretch>
                       <a:fillRect/>
                     </a:stretch>
@@ -286,7 +304,7 @@
                     <pic:cNvPicPr/>
                   </pic:nvPicPr>
                   <pic:blipFill>
-                    <a:blip r:embed="rId11"/>
+                    <a:blip r:embed="rId12"/>
                     <a:stretch>
                       <a:fillRect/>
                     </a:stretch>

</xml_diff>